<commit_message>
chore: compile clean version of v54.1 briefs to docx format
</commit_message>
<xml_diff>
--- a/Output/appellate_argument_v54.1_Brief.docx
+++ b/Output/appellate_argument_v54.1_Brief.docx
@@ -13,7 +13,7 @@
           <w:sz w:val="20"/>
           <w:szCs w:val="20"/>
         </w:rPr>
-        <w:t xml:space="preserve">জেলা জজ আদালত, টাঙ্গাইল</w:t>
+        <w:t xml:space="preserve">जिला জজ আদালত, টাঙ্গাইল</w:t>
       </w:r>
     </w:p>
     <w:p>
@@ -51,7 +51,7 @@
           <w:sz w:val="20"/>
           <w:szCs w:val="20"/>
         </w:rPr>
-        <w:t xml:space="preserve">আপীল্যান্টপক্ষের পূর্ণাঙ্গ লিখিত যুক্তিতর্ক (Version 54 — Final Master Brief)</w:t>
+        <w:t xml:space="preserve">আপীল্যান্টপক্ষের পূর্ণাঙ্গ লিখিত যুক্তিতর্ক (Version 54.1 — Final Master Brief)</w:t>
       </w:r>
     </w:p>
     <w:p>
@@ -190,43 +190,25 @@
           <w:sz w:val="20"/>
           <w:szCs w:val="20"/>
         </w:rPr>
-        <w:t xml:space="preserve">মহামান্য আদালত, সিএস খতিয়ান প্রমাণ করে যে এই জমি মূলত প্রজা বা রায়তি সম্পত্তি ছিল না। </w:t>
-      </w:r>
-      <w:r>
-        <w:rPr>
-          <w:rFonts w:ascii="Kalpurush" w:cs="Kalpurush" w:eastAsia="Kalpurush" w:hAnsi="Kalpurush"/>
-          <w:b/>
-          <w:bCs/>
-          <w:sz w:val="20"/>
-          <w:szCs w:val="20"/>
-        </w:rPr>
-        <w:t xml:space="preserve">অতএব, বিবাদীরা যদি মালিকানা হস্তান্তরের দাবি করেন, তাহলে আব্দুল করিমের স্বত্ব প্রথমে প্রমাণ করিবেন – যা তাঁরা করেননি।</w:t>
-      </w:r>
-      <w:r>
-        <w:rPr>
-          <w:rFonts w:ascii="Kalpurush" w:cs="Kalpurush" w:eastAsia="Kalpurush" w:hAnsi="Kalpurush"/>
-          <w:sz w:val="20"/>
-          <w:szCs w:val="20"/>
-        </w:rPr>
-        <w:t xml:space="preserve"> অপরদিকে, এসএ খতিয়ান দ্বারা সুস্পষ্টভাবে প্রমাণিত হয় যে মধ্যস্বত্ব বিলোপ করে রাষ্ট্র সরাসরি আব্দুল আলীকে ১৬ আনা হিস্যায় রায়ত হিসেবে করদ প্রজা হিসেবে স্বীকৃতি দিয়াছে।</w:t>
-      </w:r>
-    </w:p>
-    <w:p>
-      <w:r>
-        <w:rPr>
-          <w:rFonts w:ascii="Kalpurush" w:cs="Kalpurush" w:eastAsia="Kalpurush" w:hAnsi="Kalpurush"/>
-        </w:rPr>
-        <w:t xml:space="preserve"/>
-      </w:r>
-    </w:p>
-    <w:p>
-      <w:r>
-        <w:rPr>
-          <w:rFonts w:ascii="Kalpurush" w:cs="Kalpurush" w:eastAsia="Kalpurush" w:hAnsi="Kalpurush"/>
-          <w:sz w:val="20"/>
-          <w:szCs w:val="20"/>
-        </w:rPr>
-        <w:t xml:space="preserve">বিবাদীদের পুরো প্রতিরক্ষা একটি অপ্রমাণিত Title Story-র উপর দাঁড়াইয়া আছে। Misc Case প্রমাণিত না হইলে এবং Volume Note আইনগতভাবে মূল্যহীন হইলে, ট্রায়াল কোর্টের রায় টিকিয়া থাকিতে পারে না। বিজ্ঞ বিচারিক আদালত আইনের সুপ্রতিষ্ঠিত evidentiary standard লঙ্ঘন করিয়া একটি State Record-কে খারিজ করেছেন — যাহা উচ্চ আদালতে হস্তক্ষেপযোগ্য।</w:t>
+        <w:t xml:space="preserve">মহামান্য আদালত, চূড়ান্তভাবে প্রকাশিত SA ২৩৮ নং খতিয়ান দ্বারা রাষ্ট্র আব্দুল আলীকে একক রায়ত হিসেবে স্বীকৃতি দিয়াছে। যে পক্ষ এই State Recognition অস্বীকার করে, সেই পক্ষকেই উহা ভাঙিবার জন্য নির্ভরযোগ্য প্রমাণ উপস্থাপন করিতে হইবে।</w:t>
+      </w:r>
+    </w:p>
+    <w:p>
+      <w:r>
+        <w:rPr>
+          <w:rFonts w:ascii="Kalpurush" w:cs="Kalpurush" w:eastAsia="Kalpurush" w:hAnsi="Kalpurush"/>
+        </w:rPr>
+        <w:t xml:space="preserve"/>
+      </w:r>
+    </w:p>
+    <w:p>
+      <w:r>
+        <w:rPr>
+          <w:rFonts w:ascii="Kalpurush" w:cs="Kalpurush" w:eastAsia="Kalpurush" w:hAnsi="Kalpurush"/>
+          <w:sz w:val="20"/>
+          <w:szCs w:val="20"/>
+        </w:rPr>
+        <w:t xml:space="preserve">বিবাদীদের পুরো প্রতিরক্ষা একটি অপ্রমাণিত Title Story-র উপর দাঁড়াইয়া আছে। Misc Case প্রমাণিত না হইলে এবং Volume Note আইনগতভাবে মূল্যহীন হইলে, ট্রায়াল কোর্টের রায় টিকিয়া থাকিতে পারে না। বিজ্ঞ বিচারিক আদালত আইনের সুপ্রতিষ্ঠিত evidentiary standard লঙ্ঘন করিয়া একটি State Record-কে খারিজ করিয়াছেন — যাহা উচ্চ আদালতে হস্তক্ষেপযোগ্য।</w:t>
       </w:r>
     </w:p>
     <w:p>
@@ -346,7 +328,7 @@
           <w:sz w:val="20"/>
           <w:szCs w:val="20"/>
         </w:rPr>
-        <w:t xml:space="preserve">এই আপীলে বাদীপক্ষের বক্তব্য কোনো প্রাক্-SA (Pre-SA) title reconstruction-এর উপর নির্ভরশীল নয়। রাষ্ট্র Estate Acquisition-এর পর নিজস্ব প্রশাসনিক ও জরিপ প্রক্রিয়ার মাধ্যমে SA ২৩৮ নং খতিয়ান প্রস্তুত ও চূড়ান্তভাবে প্রকাশ করে। সেই রেকর্ডে আব্দুল আলী একক রায়ত হিসেবে স্বীকৃত। অতএব বর্তমান বিতর্কের সূচনা বিন্দু ১৯৩৪ সালের কথিত পত্তন নহে; LATENCY বা রাষ্ট্র কর্তৃক চূড়ান্তভাবে স্বীকৃত SA Record।</w:t>
+        <w:t xml:space="preserve">এই আপীলে বাদীপক্ষের বক্তব্য কোনো প্রাক্-SA (Pre-SA) title reconstruction-এর উপর নির্ভরশীল নয়। রাষ্ট্র Estate Acquisition-এর পর নিজস্ব প্রশাসনিক ও জরিপ প্রক্রিয়ার মাধ্যমে SA ২৩৮ নং খতিয়ান প্রস্তুত ও চূড়ান্তভাবে প্রকাশ করে। সেই রেকর্ডে আব্দুল আলী একক রায়ত হিসেবে স্বীকৃত। অতএব বর্তমান বিতর্কের সূচনা বিন্দু ১৯৩৪ সালের কথিত পত্তন নহে; বরং রাষ্ট্র কর্তৃক চূড়ান্তভাবে স্বীকৃত SA Record।</w:t>
       </w:r>
     </w:p>
     <w:p>
@@ -424,15 +406,15 @@
           <w:sz w:val="20"/>
           <w:szCs w:val="20"/>
         </w:rPr>
-        <w:t xml:space="preserve">১৯৫৭ সালের রেজিস্ট্রিকৃত दलিলের তাৎপর্য:</w:t>
-      </w:r>
-      <w:r>
-        <w:rPr>
-          <w:rFonts w:ascii="Kalpurush" w:cs="Kalpurush" w:eastAsia="Kalpurush" w:hAnsi="Kalpurush"/>
-          <w:sz w:val="20"/>
-          <w:szCs w:val="20"/>
-        </w:rPr>
-        <w:t xml:space="preserve"> ২৩৯৮ নং রেজিস্ট্রিকৃত দলিল দ্বারা প্রমাণিত হয় যে, SA অপারেশন চলমান থাকাকালীন সময়ে আব্দুল আলী সংশ্লিষ্ট মৌজায় স্বীয় নামে প্রকাশ্যে সম্পত্তি ক্রয় ও ভোগদখল করিতেছিলেন। উক্ত দলিলভুক্ত জমিও SA ২৩৮ নং খতিয়ানের তফসিলভুক্ত জমির অংশ। ফলে দলিলটি প্রমাণ করে যে SA জরিপ ও রেকর্ড প্রস্তুতির সময় আব্দুল আলী স্থানীয়ভাবে স্বীকৃত ও পরিচিত ভূমি-স্বত্বের অধিকারী ব্যক্তি ছিলেন।</w:t>
+        <w:t xml:space="preserve">১৯৫৭ সালের রেজিস্ট্রিকৃত দলিলের তাৎপর্য:</w:t>
+      </w:r>
+      <w:r>
+        <w:rPr>
+          <w:rFonts w:ascii="Kalpurush" w:cs="Kalpurush" w:eastAsia="Kalpurush" w:hAnsi="Kalpurush"/>
+          <w:sz w:val="20"/>
+          <w:szCs w:val="20"/>
+        </w:rPr>
+        <w:t xml:space="preserve"> ২৩৯৮ নং রেজিস্ট্রিকৃত দলিল দ্বারা প্রমাণিত হয় যে, SA অপারেশন চলমান থাকাকালীন সময়ে আব্দুল আলী সংশ্লিষ্ট মৌজায় স্বীয় নামে প্রকাশ্যে সম্পত্তি ক্রয় ও ভোগদখল করিতেছিলেন। উক্ত দলিলভুক্ত জমিও পরবর্তীতে SA ২৩৮ নং খতিয়ানের অন্তর্ভুক্ত হইয়াছে। ফলে দলিলটি দেখায় যে SA অপারেশন চলাকালীন সময়ে আব্দুল আলী সংশ্লিষ্ট মৌজায় প্রকাশ্য ও স্বীকৃত ভূমি-অধিকারী ব্যক্তি হিসেবে পরিচিত ছিলেন।</w:t>
       </w:r>
     </w:p>
     <w:p>
@@ -530,7 +512,7 @@
           <w:sz w:val="20"/>
           <w:szCs w:val="20"/>
         </w:rPr>
-        <w:t xml:space="preserve">SA জরিপ authority ভুল করিয়াছেন</w:t>
+        <w:t xml:space="preserve">SA জরিপ কর্তৃপক্ষ ভুল করিয়াছেন</w:t>
       </w:r>
     </w:p>
     <w:p>
@@ -633,7 +615,7 @@
           <w:sz w:val="20"/>
           <w:szCs w:val="20"/>
         </w:rPr>
-        <w:t xml:space="preserve">আইন এতগুলো ধারাবাহিক প্রাতিষ্ঠানিক ভুলের উপর স্বত্ব প্রতিষ্ঠা করে না।</w:t>
+        <w:t xml:space="preserve">আইন এতগুলো ধারাবাহিক প্রাতিষ্ঠানিক ভুল ও কল্পকাহিনীর উপর স্বত্ব প্রতিষ্ঠা করে না।</w:t>
       </w:r>
     </w:p>
     <w:p>
@@ -781,25 +763,25 @@
           <w:sz w:val="20"/>
           <w:szCs w:val="20"/>
         </w:rPr>
-        <w:t xml:space="preserve"> অনুযায়ী, একটি খতিয়ান চূড়ান্তভাবে প্রকাশিত হইবার পর উহা আইনের দৃষ্টিতে নির্ভুল বলিয়া গণ্য হয় (Statutory Presumption of Correctness)। </w:t>
-      </w:r>
-    </w:p>
-    <w:p>
-      <w:r>
-        <w:rPr>
-          <w:rFonts w:ascii="Kalpurush" w:cs="Kalpurush" w:eastAsia="Kalpurush" w:hAnsi="Kalpurush"/>
-        </w:rPr>
-        <w:t xml:space="preserve"/>
-      </w:r>
-    </w:p>
-    <w:p>
-      <w:r>
-        <w:rPr>
-          <w:rFonts w:ascii="Kalpurush" w:cs="Kalpurush" w:eastAsia="Kalpurush" w:hAnsi="Kalpurush"/>
-          <w:sz w:val="20"/>
-          <w:szCs w:val="20"/>
-        </w:rPr>
-        <w:t xml:space="preserve"> যিনি দাবি করেন যে এই চূড়ান্ত প্রকাশিত খতিয়ান পরবর্তীতে সংশোধিত হইয়াছে, সেই সংশোধন প্রমাণের </w:t>
+        <w:t xml:space="preserve"> অনুযায়ী, একটি খতিয়ান চূড়ান্তভাবে প্রকাশিত হইবার পর উহা আইনের দৃষ্টিতে নির্ভুল বলিয়া গণ্য হয় (Statutory Presumption of Correctness)।</w:t>
+      </w:r>
+    </w:p>
+    <w:p>
+      <w:r>
+        <w:rPr>
+          <w:rFonts w:ascii="Kalpurush" w:cs="Kalpurush" w:eastAsia="Kalpurush" w:hAnsi="Kalpurush"/>
+        </w:rPr>
+        <w:t xml:space="preserve"/>
+      </w:r>
+    </w:p>
+    <w:p>
+      <w:r>
+        <w:rPr>
+          <w:rFonts w:ascii="Kalpurush" w:cs="Kalpurush" w:eastAsia="Kalpurush" w:hAnsi="Kalpurush"/>
+          <w:sz w:val="20"/>
+          <w:szCs w:val="20"/>
+        </w:rPr>
+        <w:t xml:space="preserve">যিনি দাবি করেন যে এই চূড়ান্ত প্রকাশিত খতিয়ান পরবর্তীতে সংশোধিত হইয়াছে, সেই সংশোধন প্রমাণের </w:t>
       </w:r>
       <w:r>
         <w:rPr>
@@ -810,14 +792,6 @@
           <w:szCs w:val="20"/>
         </w:rPr>
         <w:t xml:space="preserve">সম্পূর্ণ দায়ভার (Burden of Proof) তাহার উপরই বর্তায় (Evidence Act, Section 103)।</w:t>
-      </w:r>
-      <w:r>
-        <w:rPr>
-          <w:rFonts w:ascii="Kalpurush" w:cs="Kalpurush" w:eastAsia="Kalpurush" w:hAnsi="Kalpurush"/>
-          <w:sz w:val="20"/>
-          <w:szCs w:val="20"/>
-        </w:rPr>
-        <w:t xml:space="preserve"> </w:t>
       </w:r>
     </w:p>
     <w:p>
@@ -956,7 +930,7 @@
           <w:sz w:val="20"/>
           <w:szCs w:val="20"/>
         </w:rPr>
-        <w:t xml:space="preserve">কথিত ১৯৩৪ সালের পত্তন ও Misc Case No. 1181/1969 — উভয়ই আইনগতভাবে অকার্যকর</w:t>
+        <w:t xml:space="preserve">কথিত ১৯৩৪ সালের পত্তন ও Misc Case No. 1181/1969 — উভয়ই আইনগতভাবে সম্পূর্ণ অকার্যকর</w:t>
       </w:r>
     </w:p>
     <w:p>
@@ -1128,25 +1102,25 @@
           <w:sz w:val="20"/>
           <w:szCs w:val="20"/>
         </w:rPr>
-        <w:t xml:space="preserve">বিবাদীরা Misc Case-এর অস্তিত্ব দাবি করিলেও সেই কার্যবিবরণী, সমন জারির প্রমাণ, তদন্ত প্রতিবেদন, আদেশ, রায় বা প্রত্যয়িত কপি আদালতে উপস্থাপন করেননি। যে Misc Case-এর উপর নির্ভর করিয়া একটি finally published State Record পরিবর্তনের দাবি করা হইতেছে, তাহার আদেশ বা certified copy না থাকায় আদালত আদৌ জানিতে পারিতেছেন না যে উহা title matter ছিল, correction matter ছিল, না অন্য কোনো প্রশাসনিক কার্যক্রম ছিল। </w:t>
-      </w:r>
-    </w:p>
-    <w:p>
-      <w:r>
-        <w:rPr>
-          <w:rFonts w:ascii="Kalpurush" w:cs="Kalpurush" w:eastAsia="Kalpurush" w:hAnsi="Kalpurush"/>
-        </w:rPr>
-        <w:t xml:space="preserve"/>
-      </w:r>
-    </w:p>
-    <w:p>
-      <w:r>
-        <w:rPr>
-          <w:rFonts w:ascii="Kalpurush" w:cs="Kalpurush" w:eastAsia="Kalpurush" w:hAnsi="Kalpurush"/>
-          <w:sz w:val="20"/>
-          <w:szCs w:val="20"/>
-        </w:rPr>
-        <w:t xml:space="preserve">অধিকন্তু, দেওয়ানি আদালতের Misc Case-এর মাধ্যমে State Record সংশোধন বা Title adjudicate করা যায় না। </w:t>
+        <w:t xml:space="preserve">বিবাদীরা Misc Case-এর অস্তিত্ব দাবি করিলেও সেই কার্যবিবরণী, সমন জারির প্রমাণ, তদন্ত প্রতিবেদন, আদেশ, রায় বা প্রত্যয়িত কপি আদালতে উপস্থাপন করেননি। যে Misc Case-এর উপর নির্ভর করিয়া একটি finally published State Record পরিবর্তনের দাবি করা হইতেছে, তাহার আদেশ বা certified copy না থাকায় আদালত আদৌ জানিতে পারিতেছেন না যে উহা title matter ছিল, correction matter ছিল, না অন্য কোনো প্রশাসনিক কার্যক্রম ছিল।</w:t>
+      </w:r>
+    </w:p>
+    <w:p>
+      <w:r>
+        <w:rPr>
+          <w:rFonts w:ascii="Kalpurush" w:cs="Kalpurush" w:eastAsia="Kalpurush" w:hAnsi="Kalpurush"/>
+        </w:rPr>
+        <w:t xml:space="preserve"/>
+      </w:r>
+    </w:p>
+    <w:p>
+      <w:r>
+        <w:rPr>
+          <w:rFonts w:ascii="Kalpurush" w:cs="Kalpurush" w:eastAsia="Kalpurush" w:hAnsi="Kalpurush"/>
+          <w:sz w:val="20"/>
+          <w:szCs w:val="20"/>
+        </w:rPr>
+        <w:t xml:space="preserve">অধিকন্তু, দেওয়ানি আদালতের Misc Case-এর মাধ্যমে State Record সংশোধন বা Title adjudicate করা যায় না।</w:t>
       </w:r>
     </w:p>
     <w:p>
@@ -1176,7 +1150,7 @@
           <w:sz w:val="20"/>
           <w:szCs w:val="20"/>
         </w:rPr>
-        <w:t xml:space="preserve">তৎকালীন সময়ে বলবৎ থাকা SAT Act-এর ধারা ১৪৩A ছিল একটি বিশেষ বিধান। </w:t>
+        <w:t xml:space="preserve">تৎকালীন সময়ে বলবৎ থাকা SAT Act-এর ধারা ১৪৩A ছিল একটি বিশেষ বিধান।</w:t>
       </w:r>
     </w:p>
     <w:p>
@@ -1221,7 +1195,7 @@
           <w:sz w:val="20"/>
           <w:szCs w:val="20"/>
         </w:rPr>
-        <w:t xml:space="preserve"> প্রযোজ্য। </w:t>
+        <w:t xml:space="preserve"> প্রযোজ্য।</w:t>
       </w:r>
     </w:p>
     <w:p>
@@ -1248,7 +1222,7 @@
           <w:sz w:val="20"/>
           <w:szCs w:val="20"/>
         </w:rPr>
-        <w:t xml:space="preserve"> ধারা ১৪৩A(৪) অনুযায়ী সংশ্লিষ্ট রাজস্ব কর্মকর্তা (Revenue Officer) কর্তৃক সরেজমিনে তদন্ত (local inquiry) ও তদন্ত প্রতিবেদন দাখিল করা বাধ্যতামূলক ছিল। বিবাদীরা কোনো তদন্ত প্রতিবেদন দাখিল করতে পারেননি। </w:t>
+        <w:t xml:space="preserve"> ধারা ১৪৩A(৪) অনুযায়ী সংশ্লিষ্ট রাজস্ব কর্মকর্তা (Revenue Officer) কর্তৃক সরেজমিনে তদন্ত (local inquiry) ও তদন্ত প্রতিবেদন দাখিল করা বাধ্যতামূলক ছিল। বিবাদীরা কোনো তদন্ত প্রতিবেদন দাখিল করতে পারেননি।</w:t>
       </w:r>
     </w:p>
     <w:p>
@@ -1490,7 +1464,7 @@
           <w:sz w:val="20"/>
           <w:szCs w:val="20"/>
         </w:rPr>
-        <w:t xml:space="preserve">AC Land Volume Note কোনো স্বয়ংসম্পূর্ণ আইনি আদেশ নহে; ইহা একটি সাবসিডিয়ারি কার্যকরী নথি (subsidiary working copy) মাত্র। বিবাদীদের দাবি অনুযায়ী, এই Volume Note-টি ১৯৬৯ সালের Misc Case-এর আদেশের ভিত্তিতে লেখা হইয়াছিল। </w:t>
+        <w:t xml:space="preserve">AC Land Volume Note কোনো স্বয়ংসম্পূর্ণ আইনি আদেশ নহে; ইহা একটি সাবসিডিয়ারি কার্যকরী নথি (subsidiary working copy) মাত্র। বিবাদীদের দাবি অনুযায়ী, এই Volume Note-টি ১৯৬৯ সালের Misc Case-এর আদেশের ভিত্তিতে লেখা হইয়াছিল।</w:t>
       </w:r>
     </w:p>
     <w:p>
@@ -1970,7 +1944,7 @@
           <w:sz w:val="20"/>
           <w:szCs w:val="20"/>
         </w:rPr>
-        <w:t xml:space="preserve">যদি ১৯৬৯ সালে বৈধ আইনি সংশোধন সংঘটিত হইয়া থাকিত, তবে সেই সংশোধনের সর্বপ্রথম প্রতিফলন ঘটিত District Record Room-এর মূল SA খতিয়ানে। অথচ আজও মূল খতিয়ান অপরিবর্তিত। Authoritative Record-এর নীরবতা একটি AC Land Working Copy-র কালির নোট অপেক্ষা lifeguards বহুগুণ অধিক বিশ্বাসযোগ্য।</w:t>
+        <w:t xml:space="preserve">যদি ১৯৬৯ সালে বৈধ আইনি সংশোধন সংঘটিত হইয়া থাকিত, তবে সেই সংশোধনের সর্বপ্রথম প্রতিফলন ঘটিত District Record Room-এর মূল SA খতিয়ানে। অথচ আজও মূল খতিয়ান অপরিবর্তিত। Authoritative Record-এর নীরবতা একটি AC Land Working Copy-র কালির নোট অপেক্ষা বহুগুণ অধিক বিশ্বাসযোগ্য।</w:t>
       </w:r>
     </w:p>
     <w:p>
@@ -2021,7 +1995,7 @@
           <w:sz w:val="20"/>
           <w:szCs w:val="20"/>
         </w:rPr>
-        <w:t xml:space="preserve">AC Land-এর এখতিয়ার বহির্ভূত কারসাজি এবং ট্রায়াল কোর্টের Evidentiary Standard Error</w:t>
+        <w:t xml:space="preserve">AC Land-এর এখতিয়ার এবং ট্রায়াল কোর্টের Evidentiary Standard Error</w:t>
       </w:r>
     </w:p>
     <w:p>
@@ -2057,7 +2031,7 @@
           <w:sz w:val="20"/>
           <w:szCs w:val="20"/>
         </w:rPr>
-        <w:t xml:space="preserve">বিবাদীপক্ষের দাবিটি খতিয়ানে কোনো সাধারণ 'করণিক ভুল' (Clerical Mistake) বা নামের বানান সংশোধনের বিষয় নহে। তাহারা দাবি করিতেছেন যে একটি চূড়ান্তভাবে প্রকাশিত রাষ্ট্র-স্বীকৃত SA খতিয়ানে নতুন অংশীদার (co-sharer) যুক্ত করা হইয়াছে এবং মূল রায়তের স্বত্ব কর্তন করা হইয়াছে। </w:t>
+        <w:t xml:space="preserve">বিবাদীপক্ষের দাবিটি খতিয়ানে কোনো সাধারণ 'করণিক ভুল' (Clerical Mistake) বা নামের বানান সংশোধনের বিষয় নহে। তাহারা দাবি করিতেছেন যে একটি চূড়ান্তভাবে প্রকাশিত রাষ্ট্র-স্বীকৃত SA খতিয়ানে নতুন অংশীদার (co-sharer) যুক্ত করা হইয়াছে এবং মূল রায়তের স্বত্ব কর্তন করা হইয়াছে।</w:t>
       </w:r>
     </w:p>
     <w:p>
@@ -2085,33 +2059,33 @@
           <w:sz w:val="20"/>
           <w:szCs w:val="20"/>
         </w:rPr>
-        <w:t xml:space="preserve">AC Land বা রাজস্ব কর্মকর্তার এখতিয়ার কেবল করণিক ভুল সংশোধনের মধ্যে সীমাবদ্ধ।</w:t>
-      </w:r>
-      <w:r>
-        <w:rPr>
-          <w:rFonts w:ascii="Kalpurush" w:cs="Kalpurush" w:eastAsia="Kalpurush" w:hAnsi="Kalpurush"/>
-          <w:sz w:val="20"/>
-          <w:szCs w:val="20"/>
-        </w:rPr>
-        <w:t xml:space="preserve"> খতিয়ানে সম্পূর্ণ নতুন অংশীদার যুক্ত করা বা স্বত্বের মৌলিক পরিবর্তন (adversarial title displacement) করার কোনো এখতিয়ার AC Land-এর নাই; এটি কেবল উপযুক্ত দেওয়ানি আদালতের এখতিয়ারভুক্ত। </w:t>
-      </w:r>
-    </w:p>
-    <w:p>
-      <w:r>
-        <w:rPr>
-          <w:rFonts w:ascii="Kalpurush" w:cs="Kalpurush" w:eastAsia="Kalpurush" w:hAnsi="Kalpurush"/>
-        </w:rPr>
-        <w:t xml:space="preserve"/>
-      </w:r>
-    </w:p>
-    <w:p>
-      <w:r>
-        <w:rPr>
-          <w:rFonts w:ascii="Kalpurush" w:cs="Kalpurush" w:eastAsia="Kalpurush" w:hAnsi="Kalpurush"/>
-          <w:sz w:val="20"/>
-          <w:szCs w:val="20"/>
-        </w:rPr>
-        <w:t xml:space="preserve">কিন্তু ট্রায়াল কোর্ট একটি অপ্রমাণিত Misc Case এবং এখতিয়ার বহির্ভূতভাবে AC Land অফিসে লেখা একটি parent-file বিহীন volume note-এর উপর ভিত্তি করিয়া এই最高 মাত্রার দাবিকে গ্রহণ করিয়াছেন। আপীল্যান্ট বাদীপক্ষ এবং সোলেনামাকারী ১নং রেসপন্ডেন্ট সোলায়মান হোসেন — উভয়েই আব্দুল আলীর বৈধ উত্তরাধিকারী এবং উভয়েই বাটোয়ারায় সম্মত। একটি তৃতীয় পক্ষের এখতিয়ার-বহির্ভূত ও ভিত্তিহীন দাবির কারণে প্রকৃত ওয়ারিশদের বন্টন আটকাইয়া রাখার কোনো আইনগত যৌক্তিকতা নাই।</w:t>
+        <w:t xml:space="preserve">AC Land বা রাজস্ব কর্মকর্তার mutation jurisdiction স্বত্ব নির্ধারণের (adjudication of title) jurisdiction নহে। নতুন অংশীদার সংযোজন বা বিদ্যমান রায়তের স্বত্ব কর্তন করিয়া প্রতিদ্বন্দ্বী স্বত্ব সৃষ্টি করা তাহার এখতিয়ারভুক্ত নহে।</w:t>
+      </w:r>
+      <w:r>
+        <w:rPr>
+          <w:rFonts w:ascii="Kalpurush" w:cs="Kalpurush" w:eastAsia="Kalpurush" w:hAnsi="Kalpurush"/>
+          <w:sz w:val="20"/>
+          <w:szCs w:val="20"/>
+        </w:rPr>
+        <w:t xml:space="preserve"> এটি কেবল উপযুক্ত দেওয়ানি আদালতের এখতিয়ারভুক্ত।</w:t>
+      </w:r>
+    </w:p>
+    <w:p>
+      <w:r>
+        <w:rPr>
+          <w:rFonts w:ascii="Kalpurush" w:cs="Kalpurush" w:eastAsia="Kalpurush" w:hAnsi="Kalpurush"/>
+        </w:rPr>
+        <w:t xml:space="preserve"/>
+      </w:r>
+    </w:p>
+    <w:p>
+      <w:r>
+        <w:rPr>
+          <w:rFonts w:ascii="Kalpurush" w:cs="Kalpurush" w:eastAsia="Kalpurush" w:hAnsi="Kalpurush"/>
+          <w:sz w:val="20"/>
+          <w:szCs w:val="20"/>
+        </w:rPr>
+        <w:t xml:space="preserve">কিন্তু ট্রায়াল কোর্ট একটি অপ্রমাণিত Misc Case এবং এখতিয়ার বহির্ভূতভাবে AC Land অফিসে লেখা একটি parent-file বিহীন volume note-এর উপর ভিত্তি করিয়া এই সর্বোচ্চ মাত্রার দাবিকে গ্রহণ করিয়াছেন। আপীল্যান্ট বাদীপক্ষ এবং সোলেনামাকারী ১নং রেসপন্ডেন্ট সোলায়মান হোসেন — উভয়েই আব্দুল আলীর বৈধ উত্তরাধিকারী এবং উভয়েই বাটোয়ারায় সম্মত। একটি তৃতীয় পক্ষের এখতিয়ার-বহির্ভূত ও ভিত্তিহীন দাবির কারণে প্রকৃত ওয়ারিশদের বন্টন আটকাইয়া রাখার কোনো আইনগত যৌক্তিকতা নাই।</w:t>
       </w:r>
     </w:p>
     <w:p>
@@ -2215,15 +2189,7 @@
           <w:sz w:val="20"/>
           <w:szCs w:val="20"/>
         </w:rPr>
-        <w:t xml:space="preserve">মহামান্য আদালত, </w:t>
-      </w:r>
-    </w:p>
-    <w:p>
-      <w:r>
-        <w:rPr>
-          <w:rFonts w:ascii="Kalpurush" w:cs="Kalpurush" w:eastAsia="Kalpurush" w:hAnsi="Kalpurush"/>
-        </w:rPr>
-        <w:t xml:space="preserve"/>
+        <w:t xml:space="preserve">মহামান্য আদালত,</w:t>
       </w:r>
     </w:p>
     <w:p>
@@ -2273,22 +2239,6 @@
         </w:rPr>
         <w:t xml:space="preserve">"অত্রাকারে ও প্রকারে মামলা চলিতে আইনগত কোনো বাধা নাই।"</w:t>
       </w:r>
-      <w:r>
-        <w:rPr>
-          <w:rFonts w:ascii="Kalpurush" w:cs="Kalpurush" w:eastAsia="Kalpurush" w:hAnsi="Kalpurush"/>
-          <w:sz w:val="20"/>
-          <w:szCs w:val="20"/>
-        </w:rPr>
-        <w:t xml:space="preserve"> </w:t>
-      </w:r>
-    </w:p>
-    <w:p>
-      <w:r>
-        <w:rPr>
-          <w:rFonts w:ascii="Kalpurush" w:cs="Kalpurush" w:eastAsia="Kalpurush" w:hAnsi="Kalpurush"/>
-        </w:rPr>
-        <w:t xml:space="preserve"/>
-      </w:r>
     </w:p>
     <w:p>
       <w:r>
@@ -2307,7 +2257,7 @@
           <w:sz w:val="20"/>
           <w:szCs w:val="20"/>
         </w:rPr>
-        <w:t xml:space="preserve"> পৃথক খতিয়ানে একই দাগ থাকিলে সমগ্র দাগ hotchpot-এ আনা বাধ্যতামূলক নহে (27 BLD 229)। সরকারি জমি আনিলে বরঞ্চ মামলাই চলিত না। এই व्यक्तिगत বাটোয়ারা মামলায় সরকার কোনো necessary party নহে।</w:t>
+        <w:t xml:space="preserve"> পৃথক খতিয়ানে একই দাগ থাকিলে সমগ্র দাগ hotchpot-এ আনা বাধ্যতামূলক নহে (27 BLD 229)। সরকারি জমি আনিলে বরঞ্চ মামলাই চলিত না। এই ব্যক্তিগত বাটোয়ারা মামলায় সরকার কোনো necessary party নহে।</w:t>
       </w:r>
     </w:p>
     <w:p>
@@ -2458,14 +2408,6 @@
       <w:r>
         <w:rPr>
           <w:rFonts w:ascii="Kalpurush" w:cs="Kalpurush" w:eastAsia="Kalpurush" w:hAnsi="Kalpurush"/>
-        </w:rPr>
-        <w:t xml:space="preserve"/>
-      </w:r>
-    </w:p>
-    <w:p>
-      <w:r>
-        <w:rPr>
-          <w:rFonts w:ascii="Kalpurush" w:cs="Kalpurush" w:eastAsia="Kalpurush" w:hAnsi="Kalpurush"/>
           <w:sz w:val="20"/>
           <w:szCs w:val="20"/>
         </w:rPr>
@@ -2487,7 +2429,7 @@
           <w:sz w:val="20"/>
           <w:szCs w:val="20"/>
         </w:rPr>
-        <w:t xml:space="preserve"> (১২৫৯ দাগ) রহিয়াছে। </w:t>
+        <w:t xml:space="preserve"> (১২৫৯ দাগ) রহিয়াছে।</w:t>
       </w:r>
     </w:p>
     <w:p>
@@ -2754,7 +2696,7 @@
           <w:sz w:val="20"/>
           <w:szCs w:val="20"/>
         </w:rPr>
-        <w:t xml:space="preserve">মহামান্য আদালত, </w:t>
+        <w:t xml:space="preserve">মহামান্য আদালত,</w:t>
       </w:r>
     </w:p>
     <w:p>
@@ -3516,7 +3458,7 @@
           <w:sz w:val="20"/>
           <w:szCs w:val="20"/>
         </w:rPr>
-        <w:t xml:space="preserve">সহয়ক নজির:</w:t>
+        <w:t xml:space="preserve">সহায়ক নজির:</w:t>
       </w:r>
     </w:p>
     <w:p>
@@ -3629,7 +3571,7 @@
                 <w:sz w:val="20"/>
                 <w:szCs w:val="20"/>
               </w:rPr>
-              <w:t xml:space="preserve">১২</w:t>
+              <w:t xml:space="preserve">१२</w:t>
             </w:r>
           </w:p>
         </w:tc>

</xml_diff>